<commit_message>
zalo-pre-submit-review: add missing AI/chatbot content-disclaimer checklist item
Discovered via a real Zalo rejection email on a client Mini App (not a
false positive in scan_static_checklist.py or check_updates.py hash
diff). Verified the requirement is NOT YET published on the official
censorship-policy page (read all 9 sections live, 2026-10-02) -- Zalo
is enforcing it through manual review ahead of written docs.

- checklist.md: +1 item under Nhom A4 (Noi dung Mini App), stats
  217->218, Nhom A 53->54 (partial 20->21), total partial 75->76.
- checklist.docx: regenerated via documented parse script.
- CHANGELOG.md: v1.3.0 entry with provenance + note that
  check_updates.py cannot catch this class of change (pre-publication
  enforcement via rejection feedback).
- SKILL.md: stat references 217/75 -> 218/76.
</commit_message>
<xml_diff>
--- a/zalo-pre-submit-review/checklist.docx
+++ b/zalo-pre-submit-review/checklist.docx
@@ -17,7 +17,6 @@
       <w:r>
         <w:rPr>
           <w:i/>
-          <w:color w:val="555555"/>
         </w:rPr>
         <w:t>Checklist tổng hợp từ tài liệu chính thức Zalo Mini App (mini.zalo.me / miniapp.zaloplatforms.com) để rà soát TRƯỚC khi nộp một Mini App (bản mới hoặc bản cập nhật) lên vòng xét duyệt của Zalo. Mục tiêu: bắt trước các lỗi khiến hồ sơ bị từ chối/chậm duyệt (3–7 ngày làm việc mỗi vòng), thay vì phát hiện sau khi Zalo trả về.</w:t>
       </w:r>
@@ -30,14 +29,12 @@
         <w:rPr>
           <w:b/>
           <w:i/>
-          <w:color w:val="555555"/>
         </w:rPr>
         <w:t>Cách đọc mỗi mục:</w:t>
       </w:r>
       <w:r>
         <w:rPr>
           <w:i/>
-          <w:color w:val="555555"/>
         </w:rPr>
         <w:t xml:space="preserve"> </w:t>
       </w:r>
@@ -45,8 +42,6 @@
         <w:rPr>
           <w:rFonts w:ascii="Consolas" w:hAnsi="Consolas"/>
           <w:i/>
-          <w:color w:val="555555"/>
-          <w:sz w:val="19"/>
         </w:rPr>
         <w:t>- [ ] &lt;yêu cầu cụ thể&gt; — Nguồn: &lt;URL#anchor&gt;. &lt;lý do/hậu quả nếu vi phạm&gt;. Automatable: yes | partial | no — &lt;cách một AI agent có thể kiểm tra&gt;.</w:t>
       </w:r>
@@ -58,7 +53,6 @@
       <w:r>
         <w:rPr>
           <w:i/>
-          <w:color w:val="555555"/>
         </w:rPr>
         <w:t xml:space="preserve">- </w:t>
       </w:r>
@@ -66,14 +60,12 @@
         <w:rPr>
           <w:b/>
           <w:i/>
-          <w:color w:val="555555"/>
         </w:rPr>
         <w:t>Automatable: yes</w:t>
       </w:r>
       <w:r>
         <w:rPr>
           <w:i/>
-          <w:color w:val="555555"/>
         </w:rPr>
         <w:t xml:space="preserve"> — có thể viết script/agent kiểm tra tự động 100% (static scan code, config, hoặc dynamic browser test có kết quả nhị phân rõ ràng).</w:t>
       </w:r>
@@ -85,7 +77,6 @@
       <w:r>
         <w:rPr>
           <w:i/>
-          <w:color w:val="555555"/>
         </w:rPr>
         <w:t xml:space="preserve">- </w:t>
       </w:r>
@@ -93,14 +84,12 @@
         <w:rPr>
           <w:b/>
           <w:i/>
-          <w:color w:val="555555"/>
         </w:rPr>
         <w:t>Automatable: partial</w:t>
       </w:r>
       <w:r>
         <w:rPr>
           <w:i/>
-          <w:color w:val="555555"/>
         </w:rPr>
         <w:t xml:space="preserve"> — agent kiểm tra được MỘT PHẦN (phát hiện dấu hiệu/nghi vấn), phần còn lại (nội dung, ngữ nghĩa, pháp lý) cần người review.</w:t>
       </w:r>
@@ -112,7 +101,6 @@
       <w:r>
         <w:rPr>
           <w:i/>
-          <w:color w:val="555555"/>
         </w:rPr>
         <w:t xml:space="preserve">- </w:t>
       </w:r>
@@ -120,14 +108,12 @@
         <w:rPr>
           <w:b/>
           <w:i/>
-          <w:color w:val="555555"/>
         </w:rPr>
         <w:t>Automatable: no</w:t>
       </w:r>
       <w:r>
         <w:rPr>
           <w:i/>
-          <w:color w:val="555555"/>
         </w:rPr>
         <w:t xml:space="preserve"> — hoàn toàn thủ công/pháp lý/hành chính, agent chỉ nhắc nhở trong checklist, không tự kiểm tra được.</w:t>
       </w:r>
@@ -139,9 +125,8 @@
       <w:r>
         <w:rPr>
           <w:i/>
-          <w:color w:val="555555"/>
         </w:rPr>
-        <w:t>Cập nhật lần cuối: 2026-09-03. Nguồn tài liệu đầy đủ liệt kê ở Phụ lục cuối file.</w:t>
+        <w:t>Cập nhật lần cuối: 2026-10-02 (thêm 1 mục A4 — yêu cầu popup cảnh báo nội dung AI, phát hiện qua phản hồi từ chối thực tế của Zalo, chưa có trong tài liệu công khai). Baseline gốc 217 mục: 2026-09-03. Nguồn tài liệu đầy đủ liệt kê ở Phụ lục cuối file.</w:t>
       </w:r>
     </w:p>
     <w:p>
@@ -156,7 +141,6 @@
       <w:tblPr>
         <w:tblStyle w:val="LightGrid-Accent1"/>
         <w:tblW w:type="auto" w:w="0"/>
-        <w:jc w:val="center"/>
         <w:tblLook w:firstColumn="1" w:firstRow="1" w:lastColumn="0" w:lastRow="0" w:noHBand="0" w:noVBand="1" w:val="04A0"/>
       </w:tblPr>
       <w:tblGrid>
@@ -173,14 +157,6 @@
           </w:tcPr>
           <w:p>
             <w:r>
-              <w:rPr>
-                <w:b/>
-              </w:rPr>
-            </w:r>
-            <w:r>
-              <w:rPr>
-                <w:b/>
-              </w:rPr>
               <w:t>Nhóm</w:t>
             </w:r>
           </w:p>
@@ -191,14 +167,6 @@
           </w:tcPr>
           <w:p>
             <w:r>
-              <w:rPr>
-                <w:b/>
-              </w:rPr>
-            </w:r>
-            <w:r>
-              <w:rPr>
-                <w:b/>
-              </w:rPr>
               <w:t>Tổng số mục</w:t>
             </w:r>
           </w:p>
@@ -209,14 +177,6 @@
           </w:tcPr>
           <w:p>
             <w:r>
-              <w:rPr>
-                <w:b/>
-              </w:rPr>
-            </w:r>
-            <w:r>
-              <w:rPr>
-                <w:b/>
-              </w:rPr>
               <w:t>Automatable: yes</w:t>
             </w:r>
           </w:p>
@@ -227,14 +187,6 @@
           </w:tcPr>
           <w:p>
             <w:r>
-              <w:rPr>
-                <w:b/>
-              </w:rPr>
-            </w:r>
-            <w:r>
-              <w:rPr>
-                <w:b/>
-              </w:rPr>
               <w:t>partial</w:t>
             </w:r>
           </w:p>
@@ -245,14 +197,6 @@
           </w:tcPr>
           <w:p>
             <w:r>
-              <w:rPr>
-                <w:b/>
-              </w:rPr>
-            </w:r>
-            <w:r>
-              <w:rPr>
-                <w:b/>
-              </w:rPr>
               <w:t>no</w:t>
             </w:r>
           </w:p>
@@ -264,7 +208,6 @@
             <w:tcW w:type="dxa" w:w="1728"/>
           </w:tcPr>
           <w:p>
-            <w:r/>
             <w:r>
               <w:t>Nhóm A — Chính sách nội dung &amp; kiểm duyệt (Censorship Policy)</w:t>
             </w:r>
@@ -275,9 +218,8 @@
             <w:tcW w:type="dxa" w:w="1728"/>
           </w:tcPr>
           <w:p>
-            <w:r/>
             <w:r>
-              <w:t>53</w:t>
+              <w:t>54</w:t>
             </w:r>
           </w:p>
         </w:tc>
@@ -286,7 +228,6 @@
             <w:tcW w:type="dxa" w:w="1728"/>
           </w:tcPr>
           <w:p>
-            <w:r/>
             <w:r>
               <w:t>21</w:t>
             </w:r>
@@ -297,9 +238,8 @@
             <w:tcW w:type="dxa" w:w="1728"/>
           </w:tcPr>
           <w:p>
-            <w:r/>
             <w:r>
-              <w:t>20</w:t>
+              <w:t>21</w:t>
             </w:r>
           </w:p>
         </w:tc>
@@ -308,7 +248,6 @@
             <w:tcW w:type="dxa" w:w="1728"/>
           </w:tcPr>
           <w:p>
-            <w:r/>
             <w:r>
               <w:t>12</w:t>
             </w:r>
@@ -321,7 +260,6 @@
             <w:tcW w:type="dxa" w:w="1728"/>
           </w:tcPr>
           <w:p>
-            <w:r/>
             <w:r>
               <w:t>Nhóm B — Pháp lý, hợp đồng nhà phát triển &amp; tuân thủ dữ liệu cá nhân</w:t>
             </w:r>
@@ -332,7 +270,6 @@
             <w:tcW w:type="dxa" w:w="1728"/>
           </w:tcPr>
           <w:p>
-            <w:r/>
             <w:r>
               <w:t>58</w:t>
             </w:r>
@@ -343,7 +280,6 @@
             <w:tcW w:type="dxa" w:w="1728"/>
           </w:tcPr>
           <w:p>
-            <w:r/>
             <w:r>
               <w:t>23</w:t>
             </w:r>
@@ -354,7 +290,6 @@
             <w:tcW w:type="dxa" w:w="1728"/>
           </w:tcPr>
           <w:p>
-            <w:r/>
             <w:r>
               <w:t>10</w:t>
             </w:r>
@@ -365,7 +300,6 @@
             <w:tcW w:type="dxa" w:w="1728"/>
           </w:tcPr>
           <w:p>
-            <w:r/>
             <w:r>
               <w:t>25</w:t>
             </w:r>
@@ -378,7 +312,6 @@
             <w:tcW w:type="dxa" w:w="1728"/>
           </w:tcPr>
           <w:p>
-            <w:r/>
             <w:r>
               <w:t>Nhóm C — Lỗi kỹ thuật (dev/build/runtime)</w:t>
             </w:r>
@@ -389,7 +322,6 @@
             <w:tcW w:type="dxa" w:w="1728"/>
           </w:tcPr>
           <w:p>
-            <w:r/>
             <w:r>
               <w:t>24</w:t>
             </w:r>
@@ -400,7 +332,6 @@
             <w:tcW w:type="dxa" w:w="1728"/>
           </w:tcPr>
           <w:p>
-            <w:r/>
             <w:r>
               <w:t>15</w:t>
             </w:r>
@@ -411,7 +342,6 @@
             <w:tcW w:type="dxa" w:w="1728"/>
           </w:tcPr>
           <w:p>
-            <w:r/>
             <w:r>
               <w:t>7</w:t>
             </w:r>
@@ -422,7 +352,6 @@
             <w:tcW w:type="dxa" w:w="1728"/>
           </w:tcPr>
           <w:p>
-            <w:r/>
             <w:r>
               <w:t>2</w:t>
             </w:r>
@@ -435,7 +364,6 @@
             <w:tcW w:type="dxa" w:w="1728"/>
           </w:tcPr>
           <w:p>
-            <w:r/>
             <w:r>
               <w:t>Nhóm D — UI/UX, điều hướng &amp; xác thực người dùng</w:t>
             </w:r>
@@ -446,7 +374,6 @@
             <w:tcW w:type="dxa" w:w="1728"/>
           </w:tcPr>
           <w:p>
-            <w:r/>
             <w:r>
               <w:t>23</w:t>
             </w:r>
@@ -457,7 +384,6 @@
             <w:tcW w:type="dxa" w:w="1728"/>
           </w:tcPr>
           <w:p>
-            <w:r/>
             <w:r>
               <w:t>6</w:t>
             </w:r>
@@ -468,7 +394,6 @@
             <w:tcW w:type="dxa" w:w="1728"/>
           </w:tcPr>
           <w:p>
-            <w:r/>
             <w:r>
               <w:t>17</w:t>
             </w:r>
@@ -479,7 +404,6 @@
             <w:tcW w:type="dxa" w:w="1728"/>
           </w:tcPr>
           <w:p>
-            <w:r/>
             <w:r>
               <w:t>0</w:t>
             </w:r>
@@ -492,7 +416,6 @@
             <w:tcW w:type="dxa" w:w="1728"/>
           </w:tcPr>
           <w:p>
-            <w:r/>
             <w:r>
               <w:t>Nhóm E — Quy trình nộp duyệt &amp; khai báo quyền (Submission &amp; Permissions)</w:t>
             </w:r>
@@ -503,7 +426,6 @@
             <w:tcW w:type="dxa" w:w="1728"/>
           </w:tcPr>
           <w:p>
-            <w:r/>
             <w:r>
               <w:t>55</w:t>
             </w:r>
@@ -514,7 +436,6 @@
             <w:tcW w:type="dxa" w:w="1728"/>
           </w:tcPr>
           <w:p>
-            <w:r/>
             <w:r>
               <w:t>26</w:t>
             </w:r>
@@ -525,7 +446,6 @@
             <w:tcW w:type="dxa" w:w="1728"/>
           </w:tcPr>
           <w:p>
-            <w:r/>
             <w:r>
               <w:t>19</w:t>
             </w:r>
@@ -536,7 +456,6 @@
             <w:tcW w:type="dxa" w:w="1728"/>
           </w:tcPr>
           <w:p>
-            <w:r/>
             <w:r>
               <w:t>10</w:t>
             </w:r>
@@ -549,7 +468,6 @@
             <w:tcW w:type="dxa" w:w="1728"/>
           </w:tcPr>
           <w:p>
-            <w:r/>
             <w:r>
               <w:t>Nhóm F — Cộng đồng, thông báo &amp; điều khoản bổ sung</w:t>
             </w:r>
@@ -560,7 +478,6 @@
             <w:tcW w:type="dxa" w:w="1728"/>
           </w:tcPr>
           <w:p>
-            <w:r/>
             <w:r>
               <w:t>4</w:t>
             </w:r>
@@ -571,7 +488,6 @@
             <w:tcW w:type="dxa" w:w="1728"/>
           </w:tcPr>
           <w:p>
-            <w:r/>
             <w:r>
               <w:t>1</w:t>
             </w:r>
@@ -582,7 +498,6 @@
             <w:tcW w:type="dxa" w:w="1728"/>
           </w:tcPr>
           <w:p>
-            <w:r/>
             <w:r>
               <w:t>2</w:t>
             </w:r>
@@ -593,7 +508,6 @@
             <w:tcW w:type="dxa" w:w="1728"/>
           </w:tcPr>
           <w:p>
-            <w:r/>
             <w:r>
               <w:t>1</w:t>
             </w:r>
@@ -606,11 +520,7 @@
             <w:tcW w:type="dxa" w:w="1728"/>
           </w:tcPr>
           <w:p>
-            <w:r/>
             <w:r>
-              <w:rPr>
-                <w:b/>
-              </w:rPr>
               <w:t>Tổng</w:t>
             </w:r>
           </w:p>
@@ -620,12 +530,8 @@
             <w:tcW w:type="dxa" w:w="1728"/>
           </w:tcPr>
           <w:p>
-            <w:r/>
             <w:r>
-              <w:rPr>
-                <w:b/>
-              </w:rPr>
-              <w:t>217</w:t>
+              <w:t>218</w:t>
             </w:r>
           </w:p>
         </w:tc>
@@ -634,11 +540,7 @@
             <w:tcW w:type="dxa" w:w="1728"/>
           </w:tcPr>
           <w:p>
-            <w:r/>
             <w:r>
-              <w:rPr>
-                <w:b/>
-              </w:rPr>
               <w:t>92</w:t>
             </w:r>
           </w:p>
@@ -648,12 +550,8 @@
             <w:tcW w:type="dxa" w:w="1728"/>
           </w:tcPr>
           <w:p>
-            <w:r/>
             <w:r>
-              <w:rPr>
-                <w:b/>
-              </w:rPr>
-              <w:t>75</w:t>
+              <w:t>76</w:t>
             </w:r>
           </w:p>
         </w:tc>
@@ -662,23 +560,17 @@
             <w:tcW w:type="dxa" w:w="1728"/>
           </w:tcPr>
           <w:p>
-            <w:r/>
             <w:r>
-              <w:rPr>
-                <w:b/>
-              </w:rPr>
               <w:t>50</w:t>
             </w:r>
           </w:p>
         </w:tc>
       </w:tr>
     </w:tbl>
-    <w:p/>
     <w:p>
       <w:r>
         <w:rPr>
           <w:rFonts w:ascii="Consolas" w:hAnsi="Consolas"/>
-          <w:sz w:val="19"/>
         </w:rPr>
         <w:t>yes</w:t>
       </w:r>
@@ -688,7 +580,6 @@
       <w:r>
         <w:rPr>
           <w:rFonts w:ascii="Consolas" w:hAnsi="Consolas"/>
-          <w:sz w:val="19"/>
         </w:rPr>
         <w:t>partial</w:t>
       </w:r>
@@ -698,7 +589,6 @@
       <w:r>
         <w:rPr>
           <w:rFonts w:ascii="Consolas" w:hAnsi="Consolas"/>
-          <w:sz w:val="19"/>
         </w:rPr>
         <w:t>no</w:t>
       </w:r>
@@ -713,7 +603,6 @@
       <w:r>
         <w:rPr>
           <w:rFonts w:ascii="Consolas" w:hAnsi="Consolas"/>
-          <w:sz w:val="19"/>
         </w:rPr>
         <w:t>yes</w:t>
       </w:r>
@@ -723,7 +612,6 @@
       <w:r>
         <w:rPr>
           <w:rFonts w:ascii="Consolas" w:hAnsi="Consolas"/>
-          <w:sz w:val="19"/>
         </w:rPr>
         <w:t>partial</w:t>
       </w:r>
@@ -733,7 +621,6 @@
       <w:r>
         <w:rPr>
           <w:rFonts w:ascii="Consolas" w:hAnsi="Consolas"/>
-          <w:sz w:val="19"/>
         </w:rPr>
         <w:t>no</w:t>
       </w:r>
@@ -1034,7 +921,6 @@
       <w:r>
         <w:rPr>
           <w:rFonts w:ascii="Consolas" w:hAnsi="Consolas"/>
-          <w:sz w:val="19"/>
         </w:rPr>
         <w:t>signInWithGoogle</w:t>
       </w:r>
@@ -1055,7 +941,6 @@
       <w:r>
         <w:rPr>
           <w:rFonts w:ascii="Consolas" w:hAnsi="Consolas"/>
-          <w:sz w:val="19"/>
         </w:rPr>
         <w:t>window.open</w:t>
       </w:r>
@@ -1065,7 +950,6 @@
       <w:r>
         <w:rPr>
           <w:rFonts w:ascii="Consolas" w:hAnsi="Consolas"/>
-          <w:sz w:val="19"/>
         </w:rPr>
         <w:t>&lt;a target=_blank&gt;</w:t>
       </w:r>
@@ -1093,6 +977,26 @@
       </w:r>
       <w:r>
         <w:t>Nội dung không được sai lệch, lừa đảo, giả mạo hoặc bị cấm theo pháp luật — Nguồn: #42-nội-dung-đúng-pháp-luật. Automatable: no.</w:t>
+      </w:r>
+    </w:p>
+    <w:p>
+      <w:pPr>
+        <w:pStyle w:val="ListBullet"/>
+      </w:pPr>
+      <w:r>
+        <w:t xml:space="preserve">☐ </w:t>
+      </w:r>
+      <w:r>
+        <w:t xml:space="preserve">Mini App có tính năng Chatbot AI/ứng dụng công nghệ AI phải hiển thị popup hoặc thông tin cảnh báo về khả năng sai sót của nội dung do AI cung cấp, đảm bảo người dùng được thông tin đầy đủ trước khi dùng tính năng đó — Nguồn: phản hồi từ chối thực tế của Zalo (email kiểm duyệt, ghi nhận 2026-10-02); </w:t>
+      </w:r>
+      <w:r>
+        <w:rPr>
+          <w:b/>
+        </w:rPr>
+        <w:t>CHƯA có trong tài liệu chính sách kiểm duyệt công khai</w:t>
+      </w:r>
+      <w:r>
+        <w:t xml:space="preserve"> tại https://miniapp.zaloplatforms.com/documents/zalo-mini-app-censorship-policy/ (đã đọc lại toàn bộ 9 mục của trang, không thấy mục này tại thời điểm cập nhật) — Zalo áp dụng qua kiểm duyệt thủ công sớm hơn khi publish văn bản chính thức, tương tự tinh thần #42-nội-dung-đúng-pháp-luật (nội dung không sai lệch). Automatable: partial — static scan tìm Mini App có route/feature chứa "chat"/"ai"/"assistant" hoặc gọi LLM API, cảnh báo thiếu nếu không tìm thấy component popup/disclaimer hiển thị trước hoặc trong màn chat; nội dung cảnh báo có đạt yêu cầu "đầy đủ" hay không cần review thủ công.</w:t>
       </w:r>
     </w:p>
     <w:p>
@@ -1277,7 +1181,6 @@
       <w:r>
         <w:rPr>
           <w:rFonts w:ascii="Consolas" w:hAnsi="Consolas"/>
-          <w:sz w:val="19"/>
         </w:rPr>
         <w:t>authorize</w:t>
       </w:r>
@@ -1287,7 +1190,6 @@
       <w:r>
         <w:rPr>
           <w:rFonts w:ascii="Consolas" w:hAnsi="Consolas"/>
-          <w:sz w:val="19"/>
         </w:rPr>
         <w:t>getSetting</w:t>
       </w:r>
@@ -2403,7 +2305,6 @@
       <w:r>
         <w:rPr>
           <w:rFonts w:ascii="Consolas" w:hAnsi="Consolas"/>
-          <w:sz w:val="19"/>
         </w:rPr>
         <w:t>Access-Control-Allow-Origin: https://h5.zdn.vn</w:t>
       </w:r>
@@ -2413,7 +2314,6 @@
       <w:r>
         <w:rPr>
           <w:rFonts w:ascii="Consolas" w:hAnsi="Consolas"/>
-          <w:sz w:val="19"/>
         </w:rPr>
         <w:t>*</w:t>
       </w:r>
@@ -2434,7 +2334,6 @@
       <w:r>
         <w:rPr>
           <w:rFonts w:ascii="Consolas" w:hAnsi="Consolas"/>
-          <w:sz w:val="19"/>
         </w:rPr>
         <w:t>OPTIONS</w:t>
       </w:r>
@@ -2455,7 +2354,6 @@
       <w:r>
         <w:rPr>
           <w:rFonts w:ascii="Consolas" w:hAnsi="Consolas"/>
-          <w:sz w:val="19"/>
         </w:rPr>
         <w:t>Access-Control-Allow-Origin</w:t>
       </w:r>
@@ -2476,7 +2374,6 @@
       <w:r>
         <w:rPr>
           <w:rFonts w:ascii="Consolas" w:hAnsi="Consolas"/>
-          <w:sz w:val="19"/>
         </w:rPr>
         <w:t>https://</w:t>
       </w:r>
@@ -2486,7 +2383,6 @@
       <w:r>
         <w:rPr>
           <w:rFonts w:ascii="Consolas" w:hAnsi="Consolas"/>
-          <w:sz w:val="19"/>
         </w:rPr>
         <w:t>http://</w:t>
       </w:r>
@@ -2496,7 +2392,6 @@
       <w:r>
         <w:rPr>
           <w:rFonts w:ascii="Consolas" w:hAnsi="Consolas"/>
-          <w:sz w:val="19"/>
         </w:rPr>
         <w:t>fetch(</w:t>
       </w:r>
@@ -2506,7 +2401,6 @@
       <w:r>
         <w:rPr>
           <w:rFonts w:ascii="Consolas" w:hAnsi="Consolas"/>
-          <w:sz w:val="19"/>
         </w:rPr>
         <w:t>axios(</w:t>
       </w:r>
@@ -2516,7 +2410,6 @@
       <w:r>
         <w:rPr>
           <w:rFonts w:ascii="Consolas" w:hAnsi="Consolas"/>
-          <w:sz w:val="19"/>
         </w:rPr>
         <w:t>http://</w:t>
       </w:r>
@@ -2537,7 +2430,6 @@
       <w:r>
         <w:rPr>
           <w:rFonts w:ascii="Consolas" w:hAnsi="Consolas"/>
-          <w:sz w:val="19"/>
         </w:rPr>
         <w:t>public</w:t>
       </w:r>
@@ -2547,7 +2439,6 @@
       <w:r>
         <w:rPr>
           <w:rFonts w:ascii="Consolas" w:hAnsi="Consolas"/>
-          <w:sz w:val="19"/>
         </w:rPr>
         <w:t>src="/coffee.jpg"</w:t>
       </w:r>
@@ -2557,7 +2448,6 @@
       <w:r>
         <w:rPr>
           <w:rFonts w:ascii="Consolas" w:hAnsi="Consolas"/>
-          <w:sz w:val="19"/>
         </w:rPr>
         <w:t>import</w:t>
       </w:r>
@@ -2567,7 +2457,6 @@
       <w:r>
         <w:rPr>
           <w:rFonts w:ascii="Consolas" w:hAnsi="Consolas"/>
-          <w:sz w:val="19"/>
         </w:rPr>
         <w:t>import coffee from "./coffee.jpg"</w:t>
       </w:r>
@@ -2577,7 +2466,6 @@
       <w:r>
         <w:rPr>
           <w:rFonts w:ascii="Consolas" w:hAnsi="Consolas"/>
-          <w:sz w:val="19"/>
         </w:rPr>
         <w:t>src="/..."</w:t>
       </w:r>
@@ -2598,7 +2486,6 @@
       <w:r>
         <w:rPr>
           <w:rFonts w:ascii="Consolas" w:hAnsi="Consolas"/>
-          <w:sz w:val="19"/>
         </w:rPr>
         <w:t>getOrderStatus</w:t>
       </w:r>
@@ -2608,7 +2495,6 @@
       <w:r>
         <w:rPr>
           <w:rFonts w:ascii="Consolas" w:hAnsi="Consolas"/>
-          <w:sz w:val="19"/>
         </w:rPr>
         <w:t>updateOrderStatus</w:t>
       </w:r>
@@ -2640,7 +2526,6 @@
       <w:r>
         <w:rPr>
           <w:rFonts w:ascii="Consolas" w:hAnsi="Consolas"/>
-          <w:sz w:val="19"/>
         </w:rPr>
         <w:t>getAccessToken</w:t>
       </w:r>
@@ -2650,7 +2535,6 @@
       <w:r>
         <w:rPr>
           <w:rFonts w:ascii="Consolas" w:hAnsi="Consolas"/>
-          <w:sz w:val="19"/>
         </w:rPr>
         <w:t>createOrder</w:t>
       </w:r>
@@ -2671,7 +2555,6 @@
       <w:r>
         <w:rPr>
           <w:rFonts w:ascii="Consolas" w:hAnsi="Consolas"/>
-          <w:sz w:val="19"/>
         </w:rPr>
         <w:t>getPhoneNumber</w:t>
       </w:r>
@@ -2681,7 +2564,6 @@
       <w:r>
         <w:rPr>
           <w:rFonts w:ascii="Consolas" w:hAnsi="Consolas"/>
-          <w:sz w:val="19"/>
         </w:rPr>
         <w:t>getLocation</w:t>
       </w:r>
@@ -2691,7 +2573,6 @@
       <w:r>
         <w:rPr>
           <w:rFonts w:ascii="Consolas" w:hAnsi="Consolas"/>
-          <w:sz w:val="19"/>
         </w:rPr>
         <w:t>openMediaPicker</w:t>
       </w:r>
@@ -2701,7 +2582,6 @@
       <w:r>
         <w:rPr>
           <w:rFonts w:ascii="Consolas" w:hAnsi="Consolas"/>
-          <w:sz w:val="19"/>
         </w:rPr>
         <w:t>requestCameraPermission</w:t>
       </w:r>
@@ -2711,7 +2591,6 @@
       <w:r>
         <w:rPr>
           <w:rFonts w:ascii="Consolas" w:hAnsi="Consolas"/>
-          <w:sz w:val="19"/>
         </w:rPr>
         <w:t>keepScreen</w:t>
       </w:r>
@@ -2801,7 +2680,6 @@
       <w:r>
         <w:rPr>
           <w:rFonts w:ascii="Consolas" w:hAnsi="Consolas"/>
-          <w:sz w:val="19"/>
         </w:rPr>
         <w:t>ZALO_APP_SECRET</w:t>
       </w:r>
@@ -2811,7 +2689,6 @@
       <w:r>
         <w:rPr>
           <w:rFonts w:ascii="Consolas" w:hAnsi="Consolas"/>
-          <w:sz w:val="19"/>
         </w:rPr>
         <w:t>ZALO_REFRESH_TOKEN</w:t>
       </w:r>
@@ -2821,7 +2698,6 @@
       <w:r>
         <w:rPr>
           <w:rFonts w:ascii="Consolas" w:hAnsi="Consolas"/>
-          <w:sz w:val="19"/>
         </w:rPr>
         <w:t>ZALO_APP_ID</w:t>
       </w:r>
@@ -2842,7 +2718,6 @@
       <w:r>
         <w:rPr>
           <w:rFonts w:ascii="Consolas" w:hAnsi="Consolas"/>
-          <w:sz w:val="19"/>
         </w:rPr>
         <w:t>MINI_APP_ID</w:t>
       </w:r>
@@ -2852,7 +2727,6 @@
       <w:r>
         <w:rPr>
           <w:rFonts w:ascii="Consolas" w:hAnsi="Consolas"/>
-          <w:sz w:val="19"/>
         </w:rPr>
         <w:t>ZALO_APP_ID</w:t>
       </w:r>
@@ -2873,7 +2747,6 @@
       <w:r>
         <w:rPr>
           <w:rFonts w:ascii="Consolas" w:hAnsi="Consolas"/>
-          <w:sz w:val="19"/>
         </w:rPr>
         <w:t>ZMP_TOKEN</w:t>
       </w:r>
@@ -2883,7 +2756,6 @@
       <w:r>
         <w:rPr>
           <w:rFonts w:ascii="Consolas" w:hAnsi="Consolas"/>
-          <w:sz w:val="19"/>
         </w:rPr>
         <w:t>.env</w:t>
       </w:r>
@@ -2893,7 +2765,6 @@
       <w:r>
         <w:rPr>
           <w:rFonts w:ascii="Consolas" w:hAnsi="Consolas"/>
-          <w:sz w:val="19"/>
         </w:rPr>
         <w:t>ZMP_TOKEN</w:t>
       </w:r>
@@ -2914,7 +2785,6 @@
       <w:r>
         <w:rPr>
           <w:rFonts w:ascii="Consolas" w:hAnsi="Consolas"/>
-          <w:sz w:val="19"/>
         </w:rPr>
         <w:t>target</w:t>
       </w:r>
@@ -2924,7 +2794,6 @@
       <w:r>
         <w:rPr>
           <w:rFonts w:ascii="Consolas" w:hAnsi="Consolas"/>
-          <w:sz w:val="19"/>
         </w:rPr>
         <w:t>esnext</w:t>
       </w:r>
@@ -2934,7 +2803,6 @@
       <w:r>
         <w:rPr>
           <w:rFonts w:ascii="Consolas" w:hAnsi="Consolas"/>
-          <w:sz w:val="19"/>
         </w:rPr>
         <w:t>vite build</w:t>
       </w:r>
@@ -2955,7 +2823,6 @@
       <w:r>
         <w:rPr>
           <w:rFonts w:ascii="Consolas" w:hAnsi="Consolas"/>
-          <w:sz w:val="19"/>
         </w:rPr>
         <w:t>openWebview</w:t>
       </w:r>
@@ -2965,7 +2832,6 @@
       <w:r>
         <w:rPr>
           <w:rFonts w:ascii="Consolas" w:hAnsi="Consolas"/>
-          <w:sz w:val="19"/>
         </w:rPr>
         <w:t>Content-Disposition</w:t>
       </w:r>
@@ -2975,7 +2841,6 @@
       <w:r>
         <w:rPr>
           <w:rFonts w:ascii="Consolas" w:hAnsi="Consolas"/>
-          <w:sz w:val="19"/>
         </w:rPr>
         <w:t>react-pdf@5.x</w:t>
       </w:r>
@@ -2985,7 +2850,6 @@
       <w:r>
         <w:rPr>
           <w:rFonts w:ascii="Consolas" w:hAnsi="Consolas"/>
-          <w:sz w:val="19"/>
         </w:rPr>
         <w:t>openWebview</w:t>
       </w:r>
@@ -2995,7 +2859,6 @@
       <w:r>
         <w:rPr>
           <w:rFonts w:ascii="Consolas" w:hAnsi="Consolas"/>
-          <w:sz w:val="19"/>
         </w:rPr>
         <w:t>.pdf</w:t>
       </w:r>
@@ -3005,7 +2868,6 @@
       <w:r>
         <w:rPr>
           <w:rFonts w:ascii="Consolas" w:hAnsi="Consolas"/>
-          <w:sz w:val="19"/>
         </w:rPr>
         <w:t>react-pdf</w:t>
       </w:r>
@@ -3026,7 +2888,6 @@
       <w:r>
         <w:rPr>
           <w:rFonts w:ascii="Consolas" w:hAnsi="Consolas"/>
-          <w:sz w:val="19"/>
         </w:rPr>
         <w:t>zmp-sdk</w:t>
       </w:r>
@@ -3036,7 +2897,6 @@
       <w:r>
         <w:rPr>
           <w:rFonts w:ascii="Consolas" w:hAnsi="Consolas"/>
-          <w:sz w:val="19"/>
         </w:rPr>
         <w:t>import "reflect-metadata"</w:t>
       </w:r>
@@ -3046,7 +2906,6 @@
       <w:r>
         <w:rPr>
           <w:rFonts w:ascii="Consolas" w:hAnsi="Consolas"/>
-          <w:sz w:val="19"/>
         </w:rPr>
         <w:t>SDKCreator</w:t>
       </w:r>
@@ -3056,7 +2915,6 @@
       <w:r>
         <w:rPr>
           <w:rFonts w:ascii="Consolas" w:hAnsi="Consolas"/>
-          <w:sz w:val="19"/>
         </w:rPr>
         <w:t>reflect-metadata</w:t>
       </w:r>
@@ -3066,7 +2924,6 @@
       <w:r>
         <w:rPr>
           <w:rFonts w:ascii="Consolas" w:hAnsi="Consolas"/>
-          <w:sz w:val="19"/>
         </w:rPr>
         <w:t>from "zmp-sdk"</w:t>
       </w:r>
@@ -3087,7 +2944,6 @@
       <w:r>
         <w:rPr>
           <w:rFonts w:ascii="Consolas" w:hAnsi="Consolas"/>
-          <w:sz w:val="19"/>
         </w:rPr>
         <w:t>^2.9+</w:t>
       </w:r>
@@ -3108,7 +2964,6 @@
       <w:r>
         <w:rPr>
           <w:rFonts w:ascii="Consolas" w:hAnsi="Consolas"/>
-          <w:sz w:val="19"/>
         </w:rPr>
         <w:t>adb</w:t>
       </w:r>
@@ -3118,7 +2973,6 @@
       <w:r>
         <w:rPr>
           <w:rFonts w:ascii="Consolas" w:hAnsi="Consolas"/>
-          <w:sz w:val="19"/>
         </w:rPr>
         <w:t>adb version</w:t>
       </w:r>
@@ -3147,7 +3001,6 @@
       <w:r>
         <w:rPr>
           <w:rFonts w:ascii="Consolas" w:hAnsi="Consolas"/>
-          <w:sz w:val="19"/>
         </w:rPr>
         <w:t>app-config.json</w:t>
       </w:r>
@@ -3157,7 +3010,6 @@
       <w:r>
         <w:rPr>
           <w:rFonts w:ascii="Consolas" w:hAnsi="Consolas"/>
-          <w:sz w:val="19"/>
         </w:rPr>
         <w:t>app.title</w:t>
       </w:r>
@@ -3178,7 +3030,6 @@
       <w:r>
         <w:rPr>
           <w:rFonts w:ascii="Consolas" w:hAnsi="Consolas"/>
-          <w:sz w:val="19"/>
         </w:rPr>
         <w:t>statusBar</w:t>
       </w:r>
@@ -3188,7 +3039,6 @@
       <w:r>
         <w:rPr>
           <w:rFonts w:ascii="Consolas" w:hAnsi="Consolas"/>
-          <w:sz w:val="19"/>
         </w:rPr>
         <w:t>actionBarHidden</w:t>
       </w:r>
@@ -3198,7 +3048,6 @@
       <w:r>
         <w:rPr>
           <w:rFonts w:ascii="Consolas" w:hAnsi="Consolas"/>
-          <w:sz w:val="19"/>
         </w:rPr>
         <w:t>hideAndroidBottomNavigationBar</w:t>
       </w:r>
@@ -3208,7 +3057,6 @@
       <w:r>
         <w:rPr>
           <w:rFonts w:ascii="Consolas" w:hAnsi="Consolas"/>
-          <w:sz w:val="19"/>
         </w:rPr>
         <w:t>hideIOSSafeAreaBottom</w:t>
       </w:r>
@@ -3218,7 +3066,6 @@
       <w:r>
         <w:rPr>
           <w:rFonts w:ascii="Consolas" w:hAnsi="Consolas"/>
-          <w:sz w:val="19"/>
         </w:rPr>
         <w:t>selfControlLoading</w:t>
       </w:r>
@@ -3239,7 +3086,6 @@
       <w:r>
         <w:rPr>
           <w:rFonts w:ascii="Consolas" w:hAnsi="Consolas"/>
-          <w:sz w:val="19"/>
         </w:rPr>
         <w:t>selfControlLoading: true</w:t>
       </w:r>
@@ -3249,7 +3095,6 @@
       <w:r>
         <w:rPr>
           <w:rFonts w:ascii="Consolas" w:hAnsi="Consolas"/>
-          <w:sz w:val="19"/>
         </w:rPr>
         <w:t>closeLoading</w:t>
       </w:r>
@@ -3259,7 +3104,6 @@
       <w:r>
         <w:rPr>
           <w:rFonts w:ascii="Consolas" w:hAnsi="Consolas"/>
-          <w:sz w:val="19"/>
         </w:rPr>
         <w:t>closeLoading</w:t>
       </w:r>
@@ -3318,7 +3162,6 @@
       <w:r>
         <w:rPr>
           <w:rFonts w:ascii="Consolas" w:hAnsi="Consolas"/>
-          <w:sz w:val="19"/>
         </w:rPr>
         <w:t>preventDefault</w:t>
       </w:r>
@@ -3328,7 +3171,6 @@
       <w:r>
         <w:rPr>
           <w:rFonts w:ascii="Consolas" w:hAnsi="Consolas"/>
-          <w:sz w:val="19"/>
         </w:rPr>
         <w:t>preventDefault()</w:t>
       </w:r>
@@ -3490,7 +3332,6 @@
       <w:r>
         <w:rPr>
           <w:rFonts w:ascii="Consolas" w:hAnsi="Consolas"/>
-          <w:sz w:val="19"/>
         </w:rPr>
         <w:t>getAccessToken</w:t>
       </w:r>
@@ -3500,7 +3341,6 @@
       <w:r>
         <w:rPr>
           <w:rFonts w:ascii="Consolas" w:hAnsi="Consolas"/>
-          <w:sz w:val="19"/>
         </w:rPr>
         <w:t>getAccessToken</w:t>
       </w:r>
@@ -3510,7 +3350,6 @@
       <w:r>
         <w:rPr>
           <w:rFonts w:ascii="Consolas" w:hAnsi="Consolas"/>
-          <w:sz w:val="19"/>
         </w:rPr>
         <w:t>graph.zalo.me</w:t>
       </w:r>
@@ -3531,7 +3370,6 @@
       <w:r>
         <w:rPr>
           <w:rFonts w:ascii="Consolas" w:hAnsi="Consolas"/>
-          <w:sz w:val="19"/>
         </w:rPr>
         <w:t>GET https://graph.zalo.me/v2.0/me</w:t>
       </w:r>
@@ -3541,7 +3379,6 @@
       <w:r>
         <w:rPr>
           <w:rFonts w:ascii="Consolas" w:hAnsi="Consolas"/>
-          <w:sz w:val="19"/>
         </w:rPr>
         <w:t>appsecret_proof</w:t>
       </w:r>
@@ -3551,7 +3388,6 @@
       <w:r>
         <w:rPr>
           <w:rFonts w:ascii="Consolas" w:hAnsi="Consolas"/>
-          <w:sz w:val="19"/>
         </w:rPr>
         <w:t>appsecret_proof</w:t>
       </w:r>
@@ -3572,7 +3408,6 @@
       <w:r>
         <w:rPr>
           <w:rFonts w:ascii="Consolas" w:hAnsi="Consolas"/>
-          <w:sz w:val="19"/>
         </w:rPr>
         <w:t>id</w:t>
       </w:r>
@@ -3582,7 +3417,6 @@
       <w:r>
         <w:rPr>
           <w:rFonts w:ascii="Consolas" w:hAnsi="Consolas"/>
-          <w:sz w:val="19"/>
         </w:rPr>
         <w:t>/v2.0/me</w:t>
       </w:r>
@@ -3609,7 +3443,6 @@
       <w:r>
         <w:rPr>
           <w:rFonts w:ascii="Consolas" w:hAnsi="Consolas"/>
-          <w:sz w:val="19"/>
         </w:rPr>
         <w:t>getAccessToken</w:t>
       </w:r>
@@ -3619,7 +3452,6 @@
       <w:r>
         <w:rPr>
           <w:rFonts w:ascii="Consolas" w:hAnsi="Consolas"/>
-          <w:sz w:val="19"/>
         </w:rPr>
         <w:t>type="password"</w:t>
       </w:r>
@@ -3640,7 +3472,6 @@
       <w:r>
         <w:rPr>
           <w:rFonts w:ascii="Consolas" w:hAnsi="Consolas"/>
-          <w:sz w:val="19"/>
         </w:rPr>
         <w:t>getPhoneNumber</w:t>
       </w:r>
@@ -3670,7 +3501,6 @@
       <w:r>
         <w:rPr>
           <w:rFonts w:ascii="Consolas" w:hAnsi="Consolas"/>
-          <w:sz w:val="19"/>
         </w:rPr>
         <w:t>getPhoneNumber</w:t>
       </w:r>
@@ -3680,7 +3510,6 @@
       <w:r>
         <w:rPr>
           <w:rFonts w:ascii="Consolas" w:hAnsi="Consolas"/>
-          <w:sz w:val="19"/>
         </w:rPr>
         <w:t>getPhoneNumber</w:t>
       </w:r>
@@ -3720,7 +3549,6 @@
       <w:r>
         <w:rPr>
           <w:rFonts w:ascii="Consolas" w:hAnsi="Consolas"/>
-          <w:sz w:val="19"/>
         </w:rPr>
         <w:t>https://zalo.me/s/{appId}/?variable=value</w:t>
       </w:r>
@@ -3741,7 +3569,6 @@
       <w:r>
         <w:rPr>
           <w:rFonts w:ascii="Consolas" w:hAnsi="Consolas"/>
-          <w:sz w:val="19"/>
         </w:rPr>
         <w:t>openMiniApp</w:t>
       </w:r>
@@ -3751,7 +3578,6 @@
       <w:r>
         <w:rPr>
           <w:rFonts w:ascii="Consolas" w:hAnsi="Consolas"/>
-          <w:sz w:val="19"/>
         </w:rPr>
         <w:t>success</w:t>
       </w:r>
@@ -3761,7 +3587,6 @@
       <w:r>
         <w:rPr>
           <w:rFonts w:ascii="Consolas" w:hAnsi="Consolas"/>
-          <w:sz w:val="19"/>
         </w:rPr>
         <w:t>fail</w:t>
       </w:r>
@@ -3771,7 +3596,6 @@
       <w:r>
         <w:rPr>
           <w:rFonts w:ascii="Consolas" w:hAnsi="Consolas"/>
-          <w:sz w:val="19"/>
         </w:rPr>
         <w:t>window.location</w:t>
       </w:r>
@@ -3792,7 +3616,6 @@
       <w:r>
         <w:rPr>
           <w:rFonts w:ascii="Consolas" w:hAnsi="Consolas"/>
-          <w:sz w:val="19"/>
         </w:rPr>
         <w:t>openWebview</w:t>
       </w:r>
@@ -3802,7 +3625,6 @@
       <w:r>
         <w:rPr>
           <w:rFonts w:ascii="Consolas" w:hAnsi="Consolas"/>
-          <w:sz w:val="19"/>
         </w:rPr>
         <w:t>window.open</w:t>
       </w:r>
@@ -3823,7 +3645,6 @@
       <w:r>
         <w:rPr>
           <w:rFonts w:ascii="Consolas" w:hAnsi="Consolas"/>
-          <w:sz w:val="19"/>
         </w:rPr>
         <w:t>createShortcut</w:t>
       </w:r>
@@ -3882,7 +3703,6 @@
       <w:r>
         <w:rPr>
           <w:rFonts w:ascii="Consolas" w:hAnsi="Consolas"/>
-          <w:sz w:val="19"/>
         </w:rPr>
         <w:t>.env</w:t>
       </w:r>
@@ -3960,7 +3780,6 @@
       <w:r>
         <w:rPr>
           <w:rFonts w:ascii="Consolas" w:hAnsi="Consolas"/>
-          <w:sz w:val="19"/>
         </w:rPr>
         <w:t>zmp start</w:t>
       </w:r>
@@ -4100,7 +3919,6 @@
       <w:r>
         <w:rPr>
           <w:rFonts w:ascii="Consolas" w:hAnsi="Consolas"/>
-          <w:sz w:val="19"/>
         </w:rPr>
         <w:t>keepScreen</w:t>
       </w:r>
@@ -4210,7 +4028,6 @@
       <w:r>
         <w:rPr>
           <w:rFonts w:ascii="Consolas" w:hAnsi="Consolas"/>
-          <w:sz w:val="19"/>
         </w:rPr>
         <w:t>getLocation</w:t>
       </w:r>
@@ -4240,7 +4057,6 @@
       <w:r>
         <w:rPr>
           <w:rFonts w:ascii="Consolas" w:hAnsi="Consolas"/>
-          <w:sz w:val="19"/>
         </w:rPr>
         <w:t>requestCameraPermission</w:t>
       </w:r>
@@ -4281,7 +4097,6 @@
       <w:r>
         <w:rPr>
           <w:rFonts w:ascii="Consolas" w:hAnsi="Consolas"/>
-          <w:sz w:val="19"/>
         </w:rPr>
         <w:t>getPhoneNumber</w:t>
       </w:r>
@@ -4579,7 +4394,6 @@
       <w:r>
         <w:rPr>
           <w:rFonts w:ascii="Consolas" w:hAnsi="Consolas"/>
-          <w:sz w:val="19"/>
         </w:rPr>
         <w:t>getAppPermissions</w:t>
       </w:r>
@@ -4660,7 +4474,6 @@
       <w:r>
         <w:rPr>
           <w:rFonts w:ascii="Consolas" w:hAnsi="Consolas"/>
-          <w:sz w:val="19"/>
         </w:rPr>
         <w:t>getAppPermissions</w:t>
       </w:r>
@@ -4670,7 +4483,6 @@
       <w:r>
         <w:rPr>
           <w:rFonts w:ascii="Consolas" w:hAnsi="Consolas"/>
-          <w:sz w:val="19"/>
         </w:rPr>
         <w:t>appId</w:t>
       </w:r>
@@ -4680,7 +4492,6 @@
       <w:r>
         <w:rPr>
           <w:rFonts w:ascii="Consolas" w:hAnsi="Consolas"/>
-          <w:sz w:val="19"/>
         </w:rPr>
         <w:t>UNREGISTERED</w:t>
       </w:r>
@@ -4690,7 +4501,6 @@
       <w:r>
         <w:rPr>
           <w:rFonts w:ascii="Consolas" w:hAnsi="Consolas"/>
-          <w:sz w:val="19"/>
         </w:rPr>
         <w:t>WAITING_APPROVAL</w:t>
       </w:r>
@@ -4700,7 +4510,6 @@
       <w:r>
         <w:rPr>
           <w:rFonts w:ascii="Consolas" w:hAnsi="Consolas"/>
-          <w:sz w:val="19"/>
         </w:rPr>
         <w:t>APPROVED</w:t>
       </w:r>
@@ -4721,7 +4530,6 @@
       <w:r>
         <w:rPr>
           <w:rFonts w:ascii="Consolas" w:hAnsi="Consolas"/>
-          <w:sz w:val="19"/>
         </w:rPr>
         <w:t>requestAppPermission</w:t>
       </w:r>
@@ -4731,7 +4539,6 @@
       <w:r>
         <w:rPr>
           <w:rFonts w:ascii="Consolas" w:hAnsi="Consolas"/>
-          <w:sz w:val="19"/>
         </w:rPr>
         <w:t>appId</w:t>
       </w:r>
@@ -4741,7 +4548,6 @@
       <w:r>
         <w:rPr>
           <w:rFonts w:ascii="Consolas" w:hAnsi="Consolas"/>
-          <w:sz w:val="19"/>
         </w:rPr>
         <w:t>permissions[]</w:t>
       </w:r>
@@ -4751,7 +4557,6 @@
       <w:r>
         <w:rPr>
           <w:rFonts w:ascii="Consolas" w:hAnsi="Consolas"/>
-          <w:sz w:val="19"/>
         </w:rPr>
         <w:t>permissionId</w:t>
       </w:r>
@@ -4761,7 +4566,6 @@
       <w:r>
         <w:rPr>
           <w:rFonts w:ascii="Consolas" w:hAnsi="Consolas"/>
-          <w:sz w:val="19"/>
         </w:rPr>
         <w:t>consentText</w:t>
       </w:r>
@@ -4771,7 +4575,6 @@
       <w:r>
         <w:rPr>
           <w:rFonts w:ascii="Consolas" w:hAnsi="Consolas"/>
-          <w:sz w:val="19"/>
         </w:rPr>
         <w:t>note</w:t>
       </w:r>
@@ -4781,7 +4584,6 @@
       <w:r>
         <w:rPr>
           <w:rFonts w:ascii="Consolas" w:hAnsi="Consolas"/>
-          <w:sz w:val="19"/>
         </w:rPr>
         <w:t>UNREGISTERED</w:t>
       </w:r>
@@ -4791,7 +4593,6 @@
       <w:r>
         <w:rPr>
           <w:rFonts w:ascii="Consolas" w:hAnsi="Consolas"/>
-          <w:sz w:val="19"/>
         </w:rPr>
         <w:t>UNREGISTERED→WAITING_APPROVAL→APPROVED</w:t>
       </w:r>
@@ -4810,7 +4611,6 @@
       <w:r>
         <w:rPr>
           <w:rFonts w:ascii="Consolas" w:hAnsi="Consolas"/>
-          <w:sz w:val="19"/>
         </w:rPr>
         <w:t>successPermissions</w:t>
       </w:r>
@@ -4831,7 +4631,6 @@
       <w:r>
         <w:rPr>
           <w:rFonts w:ascii="Consolas" w:hAnsi="Consolas"/>
-          <w:sz w:val="19"/>
         </w:rPr>
         <w:t>requestPublishMiniApp</w:t>
       </w:r>
@@ -4841,7 +4640,6 @@
       <w:r>
         <w:rPr>
           <w:rFonts w:ascii="Consolas" w:hAnsi="Consolas"/>
-          <w:sz w:val="19"/>
         </w:rPr>
         <w:t>miniAppId</w:t>
       </w:r>
@@ -4851,7 +4649,6 @@
       <w:r>
         <w:rPr>
           <w:rFonts w:ascii="Consolas" w:hAnsi="Consolas"/>
-          <w:sz w:val="19"/>
         </w:rPr>
         <w:t>versionId</w:t>
       </w:r>
@@ -4870,7 +4667,6 @@
       <w:r>
         <w:rPr>
           <w:rFonts w:ascii="Consolas" w:hAnsi="Consolas"/>
-          <w:sz w:val="19"/>
         </w:rPr>
         <w:t>description</w:t>
       </w:r>
@@ -4891,7 +4687,6 @@
       <w:r>
         <w:rPr>
           <w:rFonts w:ascii="Consolas" w:hAnsi="Consolas"/>
-          <w:sz w:val="19"/>
         </w:rPr>
         <w:t>publishMiniApp</w:t>
       </w:r>
@@ -4901,7 +4696,6 @@
       <w:r>
         <w:rPr>
           <w:rFonts w:ascii="Consolas" w:hAnsi="Consolas"/>
-          <w:sz w:val="19"/>
         </w:rPr>
         <w:t>miniAppId</w:t>
       </w:r>
@@ -4911,7 +4705,6 @@
       <w:r>
         <w:rPr>
           <w:rFonts w:ascii="Consolas" w:hAnsi="Consolas"/>
-          <w:sz w:val="19"/>
         </w:rPr>
         <w:t>versionId</w:t>
       </w:r>
@@ -4930,7 +4723,6 @@
       <w:r>
         <w:rPr>
           <w:rFonts w:ascii="Consolas" w:hAnsi="Consolas"/>
-          <w:sz w:val="19"/>
         </w:rPr>
         <w:t>publishMiniApp</w:t>
       </w:r>
@@ -4940,7 +4732,6 @@
       <w:r>
         <w:rPr>
           <w:rFonts w:ascii="Consolas" w:hAnsi="Consolas"/>
-          <w:sz w:val="19"/>
         </w:rPr>
         <w:t>requestPublishMiniApp</w:t>
       </w:r>
@@ -4961,7 +4752,6 @@
       <w:r>
         <w:rPr>
           <w:rFonts w:ascii="Consolas" w:hAnsi="Consolas"/>
-          <w:sz w:val="19"/>
         </w:rPr>
         <w:t>versions.review.done</w:t>
       </w:r>
@@ -4971,7 +4761,6 @@
       <w:r>
         <w:rPr>
           <w:rFonts w:ascii="Consolas" w:hAnsi="Consolas"/>
-          <w:sz w:val="19"/>
         </w:rPr>
         <w:t>event, appId, versionId, status (0=duyệt,-1=reject), description, timestamp</w:t>
       </w:r>
@@ -4981,7 +4770,6 @@
       <w:r>
         <w:rPr>
           <w:rFonts w:ascii="Consolas" w:hAnsi="Consolas"/>
-          <w:sz w:val="19"/>
         </w:rPr>
         <w:t>X-ZEvent-Signature</w:t>
       </w:r>
@@ -4991,7 +4779,6 @@
       <w:r>
         <w:rPr>
           <w:rFonts w:ascii="Consolas" w:hAnsi="Consolas"/>
-          <w:sz w:val="19"/>
         </w:rPr>
         <w:t>publishMiniApp</w:t>
       </w:r>
@@ -5062,7 +4849,6 @@
       <w:r>
         <w:rPr>
           <w:rFonts w:ascii="Consolas" w:hAnsi="Consolas"/>
-          <w:sz w:val="19"/>
         </w:rPr>
         <w:t>window.open</w:t>
       </w:r>
@@ -5182,7 +4968,6 @@
       <w:r>
         <w:rPr>
           <w:rFonts w:ascii="Consolas" w:hAnsi="Consolas"/>
-          <w:sz w:val="19"/>
         </w:rPr>
         <w:t>public-mini-app</w:t>
       </w:r>
@@ -5205,7 +4990,6 @@
       <w:r>
         <w:rPr>
           <w:i/>
-          <w:color w:val="555555"/>
         </w:rPr>
         <w:t xml:space="preserve">Trang cộng đồng </w:t>
       </w:r>
@@ -5213,15 +4997,12 @@
         <w:rPr>
           <w:rFonts w:ascii="Consolas" w:hAnsi="Consolas"/>
           <w:i/>
-          <w:color w:val="555555"/>
-          <w:sz w:val="19"/>
         </w:rPr>
         <w:t>https://miniapp.zaloplatforms.com/community</w:t>
       </w:r>
       <w:r>
         <w:rPr>
           <w:i/>
-          <w:color w:val="555555"/>
         </w:rPr>
         <w:t xml:space="preserve"> không có nội dung tĩnh render sẵn (cần login/JS) — không trích xuất được rule cụ thể. Kênh hỗ trợ công khai: nhóm Facebook chính thức </w:t>
       </w:r>
@@ -5229,15 +5010,12 @@
         <w:rPr>
           <w:rFonts w:ascii="Consolas" w:hAnsi="Consolas"/>
           <w:i/>
-          <w:color w:val="555555"/>
-          <w:sz w:val="19"/>
         </w:rPr>
         <w:t>https://www.facebook.com/groups/zalominiapp</w:t>
       </w:r>
       <w:r>
         <w:rPr>
           <w:i/>
-          <w:color w:val="555555"/>
         </w:rPr>
         <w:t>. Các mục dưới đây lấy từ trang giới thiệu/getting-started, không trùng lặp Nhóm A/B.</w:t>
       </w:r>
@@ -5320,11 +5098,26 @@
       </w:r>
     </w:p>
     <w:p>
+      <w:r>
+        <w:t xml:space="preserve">  - Xác thực Mini App (KYB/eKYC): .../mini-app-verification/</w:t>
+      </w:r>
+    </w:p>
+    <w:p>
+      <w:r>
+        <w:t xml:space="preserve">  - Thỏa thuận xử lý dữ liệu công khai (DPA): .../public-dpa/</w:t>
+      </w:r>
+    </w:p>
+    <w:p>
+      <w:r>
+        <w:t xml:space="preserve">  - Danh mục hàng hoá/dịch vụ có điều kiện: .../regulated-products-and-services/</w:t>
+      </w:r>
+    </w:p>
+    <w:p>
       <w:pPr>
         <w:pStyle w:val="ListBullet2"/>
       </w:pPr>
       <w:r>
-        <w:t>Xác thực Mini App (KYB/eKYC): .../mini-app-verification/</w:t>
+        <w:t>Chính sách Đối tác Giải pháp: https://mini.zalo.me/documents/solution-partner/policy/</w:t>
       </w:r>
     </w:p>
     <w:p>
@@ -5332,47 +5125,17 @@
         <w:pStyle w:val="ListBullet2"/>
       </w:pPr>
       <w:r>
-        <w:t>Thỏa thuận xử lý dữ liệu công khai (DPA): .../public-dpa/</w:t>
-      </w:r>
-    </w:p>
-    <w:p>
-      <w:pPr>
-        <w:pStyle w:val="ListBullet2"/>
-      </w:pPr>
-      <w:r>
-        <w:t>Danh mục hàng hoá/dịch vụ có điều kiện: .../regulated-products-and-services/</w:t>
-      </w:r>
-    </w:p>
-    <w:p>
-      <w:pPr>
-        <w:pStyle w:val="ListBullet2"/>
-      </w:pPr>
-      <w:r>
-        <w:t>Chính sách Đối tác Giải pháp: https://mini.zalo.me/documents/solution-partner/policy/</w:t>
-      </w:r>
-    </w:p>
-    <w:p>
-      <w:pPr>
-        <w:pStyle w:val="ListBullet2"/>
-      </w:pPr>
-      <w:r>
         <w:t>Tuân thủ Nghị định 13 (dữ liệu cá nhân): https://mini.zalo.me/documents/tutorial/update-information-about-compliance-with-decree/</w:t>
       </w:r>
     </w:p>
     <w:p>
-      <w:pPr>
-        <w:pStyle w:val="ListBullet2"/>
-      </w:pPr>
-      <w:r>
-        <w:t>Cấp quyền &amp; consent: .../granting-permission-consent/</w:t>
-      </w:r>
-    </w:p>
-    <w:p>
-      <w:pPr>
-        <w:pStyle w:val="ListBullet2"/>
-      </w:pPr>
-      <w:r>
-        <w:t>Thu hồi &amp; xoá dữ liệu user: .../revoke-and-remove-user-data/</w:t>
+      <w:r>
+        <w:t xml:space="preserve">  - Cấp quyền &amp; consent: .../granting-permission-consent/</w:t>
+      </w:r>
+    </w:p>
+    <w:p>
+      <w:r>
+        <w:t xml:space="preserve">  - Thu hồi &amp; xoá dữ liệu user: .../revoke-and-remove-user-data/</w:t>
       </w:r>
     </w:p>
     <w:p>
@@ -5884,10 +5647,6 @@
     <w:name w:val="Normal"/>
     <w:qFormat/>
     <w:rsid w:val="00FC693F"/>
-    <w:rPr>
-      <w:rFonts w:ascii="Calibri" w:hAnsi="Calibri"/>
-      <w:sz w:val="21"/>
-    </w:rPr>
   </w:style>
   <w:style w:type="paragraph" w:styleId="Header">
     <w:name w:val="header"/>

</xml_diff>